<commit_message>
Verify proposal cost figures against published market rates and add sources
Cross-checked every price in the financial tables against real Philippine
market data (DTI/BIR fees, PayMongo/Maya/PayPal gateway rates, local OTP SMS
pricing, domain and cloud hosting, Facebook/Instagram ad costs, and Metro
Manila pet-sitting rates). Corrects the off-market OTP price, reconciles the
key-metrics table with the fixed and variable cost tables, adds a basis note,
and adds sixteen verified references.

Generated with Codebuff 🤖
Co-Authored-By: Codebuff <noreply@codebuff.com>
</commit_message>
<xml_diff>
--- a/Product proposal/GROUP3_BULALA_CABUSO_DE LEON_MARQUESES_MIANA_PENOLA_SANTOS_Product Proposal.docx
+++ b/Product proposal/GROUP3_BULALA_CABUSO_DE LEON_MARQUESES_MIANA_PENOLA_SANTOS_Product Proposal.docx
@@ -1776,7 +1776,7 @@
                 <w:i w:val="0"/>
                 <w:sz w:val="24"/>
               </w:rPr>
-              <w:t>Ionic/Angular MVP build, backend, UI design</w:t>
+              <w:t>In-house Ionic/Angular MVP build, backend, and UI design (outsourced market rate: ₱150,000–₱400,000)</w:t>
             </w:r>
           </w:p>
         </w:tc>
@@ -1838,7 +1838,7 @@
                 <w:i w:val="0"/>
                 <w:sz w:val="24"/>
               </w:rPr>
-              <w:t>DTI permit, BIR, etc.</w:t>
+              <w:t>DTI business name (national scope: ₱2,030 incl. ₱30 DST) and BIR registration (₱0 fee + ₱30 DST)</w:t>
             </w:r>
           </w:p>
         </w:tc>
@@ -1900,7 +1900,7 @@
                 <w:i w:val="0"/>
                 <w:sz w:val="24"/>
               </w:rPr>
-              <w:t>Posters, Facebook ads, promo codes</w:t>
+              <w:t>Posters, Facebook/Instagram ads, promo codes (local starter budget: ₱200–₱500/day)</w:t>
             </w:r>
           </w:p>
         </w:tc>
@@ -1962,7 +1962,7 @@
                 <w:i w:val="0"/>
                 <w:sz w:val="24"/>
               </w:rPr>
-              <w:t>Domain + first-month server</w:t>
+              <w:t>Domain (.com ≈ ₱700/year) + first month of a small cloud server (≈ ₱380)</w:t>
             </w:r>
           </w:p>
         </w:tc>
@@ -2182,7 +2182,7 @@
                 <w:i w:val="0"/>
                 <w:sz w:val="24"/>
               </w:rPr>
-              <w:t>Firebase, domain, backend server</w:t>
+              <w:t>Firebase Blaze (free tier) or small cloud VPS (₱378–₱756) + domain</w:t>
             </w:r>
           </w:p>
         </w:tc>
@@ -2611,7 +2611,7 @@
                 <w:i w:val="0"/>
                 <w:sz w:val="24"/>
               </w:rPr>
-              <w:t>Transaction fees per booking (2–3% of booking amount)</w:t>
+              <w:t>Transaction fees per booking (PayMongo QR Ph 1.34%, GCash 2.23%, domestic cards 3.125% + ₱13.39)</w:t>
             </w:r>
           </w:p>
         </w:tc>
@@ -2631,7 +2631,7 @@
                 <w:i w:val="0"/>
                 <w:sz w:val="24"/>
               </w:rPr>
-              <w:t>₱15 per booking</w:t>
+              <w:t>₱15 per booking (blended)</w:t>
             </w:r>
           </w:p>
         </w:tc>
@@ -2693,7 +2693,7 @@
                 <w:i w:val="0"/>
                 <w:sz w:val="24"/>
               </w:rPr>
-              <w:t>Cost of OTP messages for login/sign-up</w:t>
+              <w:t>OTP messages for login/sign-up (Semaphore ₱0.56; UniSMS ₱0.50 per SMS)</w:t>
             </w:r>
           </w:p>
         </w:tc>
@@ -2713,7 +2713,7 @@
                 <w:i w:val="0"/>
                 <w:sz w:val="24"/>
               </w:rPr>
-              <w:t>₱1 per OTP</w:t>
+              <w:t>₱0.50 per OTP</w:t>
             </w:r>
           </w:p>
         </w:tc>
@@ -2733,7 +2733,7 @@
                 <w:i w:val="0"/>
                 <w:sz w:val="24"/>
               </w:rPr>
-              <w:t>₱300 (300 OTPs)</w:t>
+              <w:t>₱150 (300 OTPs)</w:t>
             </w:r>
           </w:p>
         </w:tc>
@@ -2857,7 +2857,7 @@
                 <w:i w:val="0"/>
                 <w:sz w:val="24"/>
               </w:rPr>
-              <w:t>Paid ads (Facebook/IG boosts)</w:t>
+              <w:t>Paid ads (Facebook/IG boosts; Meta minimum ≈₱63/day for impression campaigns)</w:t>
             </w:r>
           </w:p>
         </w:tc>
@@ -3118,7 +3118,7 @@
                 <w:i w:val="0"/>
                 <w:sz w:val="24"/>
               </w:rPr>
-              <w:t>Typical pet-sitting or grooming service</w:t>
+              <w:t>Typical pet-sitting visit (observed Metro Manila range: ₱300–₱500 per visit)</w:t>
             </w:r>
           </w:p>
         </w:tc>
@@ -3931,7 +3931,7 @@
                 <w:i w:val="0"/>
                 <w:sz w:val="24"/>
               </w:rPr>
-              <w:t>₱30 × 100 bookings</w:t>
+              <w:t>₱48.50 × 100 bookings (Table 6)</w:t>
             </w:r>
           </w:p>
         </w:tc>
@@ -3951,7 +3951,7 @@
                 <w:i w:val="0"/>
                 <w:sz w:val="24"/>
               </w:rPr>
-              <w:t>₱3,000</w:t>
+              <w:t>₱4,850</w:t>
             </w:r>
           </w:p>
         </w:tc>
@@ -3993,7 +3993,7 @@
                 <w:i w:val="0"/>
                 <w:sz w:val="24"/>
               </w:rPr>
-              <w:t>—</w:t>
+              <w:t>₱6,000 per month (Table 5)</w:t>
             </w:r>
           </w:p>
         </w:tc>
@@ -4013,7 +4013,7 @@
                 <w:i w:val="0"/>
                 <w:sz w:val="24"/>
               </w:rPr>
-              <w:t>₱4,000</w:t>
+              <w:t>₱6,000</w:t>
             </w:r>
           </w:p>
         </w:tc>
@@ -4055,7 +4055,7 @@
                 <w:i w:val="0"/>
                 <w:sz w:val="24"/>
               </w:rPr>
-              <w:t>₱54,500 – ₱7,000</w:t>
+              <w:t>₱54,500 – (₱4,850 + ₱6,000) = ₱54,500 – ₱10,850</w:t>
             </w:r>
           </w:p>
         </w:tc>
@@ -4075,7 +4075,7 @@
                 <w:i w:val="0"/>
                 <w:sz w:val="24"/>
               </w:rPr>
-              <w:t>₱47,500</w:t>
+              <w:t>₱43,650</w:t>
             </w:r>
           </w:p>
         </w:tc>
@@ -4117,7 +4117,7 @@
                 <w:i w:val="0"/>
                 <w:sz w:val="24"/>
               </w:rPr>
-              <w:t>Fixed Cost ÷ (Price – Variable Cost) = 4,000 ÷ (500–30)</w:t>
+              <w:t>Fixed Cost ÷ (Price – Variable Cost) = 6,000 ÷ (500 – 48.50)</w:t>
             </w:r>
           </w:p>
         </w:tc>
@@ -4137,7 +4137,7 @@
                 <w:i w:val="0"/>
                 <w:sz w:val="24"/>
               </w:rPr>
-              <w:t>≈ 9 bookings</w:t>
+              <w:t>≈ 14 bookings</w:t>
             </w:r>
           </w:p>
         </w:tc>
@@ -4179,7 +4179,7 @@
                 <w:i w:val="0"/>
                 <w:sz w:val="24"/>
               </w:rPr>
-              <w:t>Startup ÷ Monthly Profit = 31,500 ÷ 47,500</w:t>
+              <w:t>Startup ÷ Monthly Profit = 31,500 ÷ 43,650</w:t>
             </w:r>
           </w:p>
         </w:tc>
@@ -4199,7 +4199,7 @@
                 <w:i w:val="0"/>
                 <w:sz w:val="24"/>
               </w:rPr>
-              <w:t>≈ 0.66 month (~20 days)</w:t>
+              <w:t>≈ 0.72 month (~22 days)</w:t>
             </w:r>
           </w:p>
         </w:tc>
@@ -4241,7 +4241,7 @@
                 <w:i w:val="0"/>
                 <w:sz w:val="24"/>
               </w:rPr>
-              <w:t>(Price – Variable Cost) ÷ Price = (500–30) ÷ 500</w:t>
+              <w:t>(Price – Variable Cost) ÷ Price = (500 – 48.50) ÷ 500</w:t>
             </w:r>
           </w:p>
         </w:tc>
@@ -4261,12 +4261,26 @@
                 <w:i w:val="0"/>
                 <w:sz w:val="24"/>
               </w:rPr>
-              <w:t>94%</w:t>
+              <w:t>90%</w:t>
             </w:r>
           </w:p>
         </w:tc>
       </w:tr>
     </w:tbl>
+    <w:p>
+      <w:pPr>
+        <w:spacing w:after="120" w:before="0"/>
+      </w:pPr>
+      <w:r>
+        <w:rPr>
+          <w:rFonts w:ascii="Arial" w:hAnsi="Arial" w:cs="Arial" w:eastAsia="Arial"/>
+          <w:b w:val="0"/>
+          <w:i w:val="0"/>
+          <w:sz w:val="24"/>
+        </w:rPr>
+        <w:t>Note on the basis of the estimates. The unit prices above were checked against published market rates as of October 2026. App development is costed at the proponents’ actual in-house outlay; the market rate for an outsourced lean Philippine MVP is ₱150,000–₱400,000 (A-listware, 2025). Business registration follows DTI national-scope fees of ₱2,000 plus a ₱30 documentary stamp tax, while the BIR registration fee is now ₱0 under the Ease of Paying Taxes Act (RA 11976). Hosting reflects a .com domain of about ₱700 per year (Porkbun) plus a small cloud VPS of about ₱380 per month (DigitalOcean/Lightsail), and Firebase Blaze has a no-cost tier. Payment-gateway fees are the published rates of PayMongo (QR Ph 1.34%; domestic cards 3.125% + ₱13.39), Maya Business (cards 3.50% + ₱10; QR 1.00%), and PayPal Philippines (3.40% + ₱15). OTP messaging is priced from local providers Semaphore (₱0.56) and UniSMS (₱0.50) per SMS. The ₱500 average booking value sits within the observed Metro Manila range of ₱300–₱500 per sitter visit and ₱350–₱800 per night of boarding (PetBacker; GMA News; Philstar Life). Facebook and Instagram campaigns can start at about ₱63 per day for impressions, with local benchmarks of ₱200–₱500 per day, ₱9–₱10 per click, and ₱75–₱120 per 1,000 impressions (Spiralytics, 2026).</w:t>
+      </w:r>
+    </w:p>
     <w:p>
       <w:pPr>
         <w:spacing w:after="120" w:before="240"/>
@@ -7953,7 +7967,7 @@
           <w:i w:val="0"/>
           <w:sz w:val="24"/>
         </w:rPr>
-        <w:t>Furriend is a mobile application that connects Filipino pet owners with trusted, verified, and affordable pet sitters, addressing a real gap in the Philippine market where reliable pet care is scarce, informal, or expensive. Based on our Lean Canvas, the venture targets urban pet owners—millennials, Gen Z, and working professionals—who struggle to secure dependable care for their pets while at work, traveling, or otherwise unavailable, as well as animal lovers seeking flexible income. The solution consolidates verified sitter profiles, pet profiles, booking, in-app chat, real-time photo and video updates, secure cashless payment, and a pet-care marketplace into one platform, delivering a localized value proposition: the first trusted pet-sitting marketplace designed specifically for Filipino pet owners. Revenue comes from a 10–15% booking commission, premium sitter profiles, marketplace fees, and sponsored ads. A survey of 40 pet owners validated the concept, with 85% willing to use and pay for the service and 80% willing to recommend it, indicating strong product–market fit. With a lean cost structure, a projected breakeven of about nine bookings per month, and a first-mover advantage, Furriend is well positioned to grow within the Philippine pet-care industry.</w:t>
+        <w:t>Furriend is a mobile application that connects Filipino pet owners with trusted, verified, and affordable pet sitters, addressing a real gap in the Philippine market where reliable pet care is scarce, informal, or expensive. Based on our Lean Canvas, the venture targets urban pet owners—millennials, Gen Z, and working professionals—who struggle to secure dependable care for their pets while at work, traveling, or otherwise unavailable, as well as animal lovers seeking flexible income. The solution consolidates verified sitter profiles, pet profiles, booking, in-app chat, real-time photo and video updates, secure cashless payment, and a pet-care marketplace into one platform, delivering a localized value proposition: the first trusted pet-sitting marketplace designed specifically for Filipino pet owners. Revenue comes from a 10–15% booking commission, premium sitter profiles, marketplace fees, and sponsored ads. A survey of 40 pet owners validated the concept, with 85% willing to use and pay for the service and 80% willing to recommend it, indicating strong product–market fit. With a lean cost structure, a projected breakeven of about fourteen bookings per month, and a first-mover advantage, Furriend is well positioned to grow within the Philippine pet-care industry.</w:t>
       </w:r>
     </w:p>
     <w:p>
@@ -7983,6 +7997,66 @@
           <w:i w:val="0"/>
           <w:sz w:val="24"/>
         </w:rPr>
+        <w:t>A-listware. (2025). Mobile app development cost in the Philippines. A-listware. https://a-listware.com/blog/mobile-app-development-cost-philippines</w:t>
+      </w:r>
+    </w:p>
+    <w:p>
+      <w:pPr>
+        <w:spacing w:after="120" w:before="0"/>
+        <w:ind w:left="720" w:hanging="720"/>
+      </w:pPr>
+      <w:r>
+        <w:rPr>
+          <w:rFonts w:ascii="Arial" w:hAnsi="Arial" w:cs="Arial" w:eastAsia="Arial"/>
+          <w:b w:val="0"/>
+          <w:i w:val="0"/>
+          <w:sz w:val="24"/>
+        </w:rPr>
+        <w:t>Amazon Web Services. (2026). Amazon Lightsail pricing. AWS. https://aws.amazon.com/lightsail/pricing/</w:t>
+      </w:r>
+    </w:p>
+    <w:p>
+      <w:pPr>
+        <w:spacing w:after="120" w:before="0"/>
+        <w:ind w:left="720" w:hanging="720"/>
+      </w:pPr>
+      <w:r>
+        <w:rPr>
+          <w:rFonts w:ascii="Arial" w:hAnsi="Arial" w:cs="Arial" w:eastAsia="Arial"/>
+          <w:b w:val="0"/>
+          <w:i w:val="0"/>
+          <w:sz w:val="24"/>
+        </w:rPr>
+        <w:t>Department of Trade and Industry. (2026). Business Name Registration System: Frequently asked questions. DTI. https://bnrs.dti.gov.ph/faq</w:t>
+      </w:r>
+    </w:p>
+    <w:p>
+      <w:pPr>
+        <w:spacing w:after="120" w:before="0"/>
+        <w:ind w:left="720" w:hanging="720"/>
+      </w:pPr>
+      <w:r>
+        <w:rPr>
+          <w:rFonts w:ascii="Arial" w:hAnsi="Arial" w:cs="Arial" w:eastAsia="Arial"/>
+          <w:b w:val="0"/>
+          <w:i w:val="0"/>
+          <w:sz w:val="24"/>
+        </w:rPr>
+        <w:t>DigitalOcean. (2026). Droplet pricing. DigitalOcean. https://www.digitalocean.com/pricing/droplets</w:t>
+      </w:r>
+    </w:p>
+    <w:p>
+      <w:pPr>
+        <w:spacing w:after="120" w:before="0"/>
+        <w:ind w:left="720" w:hanging="720"/>
+      </w:pPr>
+      <w:r>
+        <w:rPr>
+          <w:rFonts w:ascii="Arial" w:hAnsi="Arial" w:cs="Arial" w:eastAsia="Arial"/>
+          <w:b w:val="0"/>
+          <w:i w:val="0"/>
+          <w:sz w:val="24"/>
+        </w:rPr>
         <w:t>Dogster. (2024, April 18). 13 pet ownership statistics in the Philippines. Dogster. https://www.dogster.com/statistics/pet-ownership-statistics-philippines</w:t>
       </w:r>
     </w:p>
@@ -7998,7 +8072,37 @@
           <w:i w:val="0"/>
           <w:sz w:val="24"/>
         </w:rPr>
+        <w:t>Firebase. (2026). Firebase pricing. Google. https://firebase.google.com/pricing</w:t>
+      </w:r>
+    </w:p>
+    <w:p>
+      <w:pPr>
+        <w:spacing w:after="120" w:before="0"/>
+        <w:ind w:left="720" w:hanging="720"/>
+      </w:pPr>
+      <w:r>
+        <w:rPr>
+          <w:rFonts w:ascii="Arial" w:hAnsi="Arial" w:cs="Arial" w:eastAsia="Arial"/>
+          <w:b w:val="0"/>
+          <w:i w:val="0"/>
+          <w:sz w:val="24"/>
+        </w:rPr>
         <w:t>Global Pet Industry. (2021, March 22). The pet industry in the Philippines. Global Pet Industry. https://globalpetindustry.com/news/the-pet-industry-in-the-philippines</w:t>
+      </w:r>
+    </w:p>
+    <w:p>
+      <w:pPr>
+        <w:spacing w:after="120" w:before="0"/>
+        <w:ind w:left="720" w:hanging="720"/>
+      </w:pPr>
+      <w:r>
+        <w:rPr>
+          <w:rFonts w:ascii="Arial" w:hAnsi="Arial" w:cs="Arial" w:eastAsia="Arial"/>
+          <w:b w:val="0"/>
+          <w:i w:val="0"/>
+          <w:sz w:val="24"/>
+        </w:rPr>
+        <w:t>GMA News. (2024, January 23). 8 pet hotels where you can entrust your furry friends. GMA News Online. https://www.gmanetwork.com/news/lifestyle/hobbiesandactivities/894718/8-pet-hotels-where-you-can-entrust-your-furry-friends/story/</w:t>
       </w:r>
     </w:p>
     <w:p>
@@ -8043,6 +8147,156 @@
           <w:i w:val="0"/>
           <w:sz w:val="24"/>
         </w:rPr>
+        <w:t>Maya. (2026). Maya Business pricing. Maya Philippines. https://www.maya.ph/business/pricing</w:t>
+      </w:r>
+    </w:p>
+    <w:p>
+      <w:pPr>
+        <w:spacing w:after="120" w:before="0"/>
+        <w:ind w:left="720" w:hanging="720"/>
+      </w:pPr>
+      <w:r>
+        <w:rPr>
+          <w:rFonts w:ascii="Arial" w:hAnsi="Arial" w:cs="Arial" w:eastAsia="Arial"/>
+          <w:b w:val="0"/>
+          <w:i w:val="0"/>
+          <w:sz w:val="24"/>
+        </w:rPr>
+        <w:t>PayMongo. (2026). Pricing. PayMongo. https://www.paymongo.com/en/pricing</w:t>
+      </w:r>
+    </w:p>
+    <w:p>
+      <w:pPr>
+        <w:spacing w:after="120" w:before="0"/>
+        <w:ind w:left="720" w:hanging="720"/>
+      </w:pPr>
+      <w:r>
+        <w:rPr>
+          <w:rFonts w:ascii="Arial" w:hAnsi="Arial" w:cs="Arial" w:eastAsia="Arial"/>
+          <w:b w:val="0"/>
+          <w:i w:val="0"/>
+          <w:sz w:val="24"/>
+        </w:rPr>
+        <w:t>PayPal. (2026). PayPal business fees – Philippines. PayPal. https://www.paypal.com/ph/business/paypal-business-fees</w:t>
+      </w:r>
+    </w:p>
+    <w:p>
+      <w:pPr>
+        <w:spacing w:after="120" w:before="0"/>
+        <w:ind w:left="720" w:hanging="720"/>
+      </w:pPr>
+      <w:r>
+        <w:rPr>
+          <w:rFonts w:ascii="Arial" w:hAnsi="Arial" w:cs="Arial" w:eastAsia="Arial"/>
+          <w:b w:val="0"/>
+          <w:i w:val="0"/>
+          <w:sz w:val="24"/>
+        </w:rPr>
+        <w:t>PetBacker. (2026). Pet house sitting and boarding rates, Metro Manila. PetBacker Philippines. https://www.petbacker.com/philippines/pet-house-sitting/metro-manila</w:t>
+      </w:r>
+    </w:p>
+    <w:p>
+      <w:pPr>
+        <w:spacing w:after="120" w:before="0"/>
+        <w:ind w:left="720" w:hanging="720"/>
+      </w:pPr>
+      <w:r>
+        <w:rPr>
+          <w:rFonts w:ascii="Arial" w:hAnsi="Arial" w:cs="Arial" w:eastAsia="Arial"/>
+          <w:b w:val="0"/>
+          <w:i w:val="0"/>
+          <w:sz w:val="24"/>
+        </w:rPr>
+        <w:t>Philstar Life. (n.d.). Pet hotels and boarding houses to consider. Philstar Life. https://philstarlife.com/living/510807-pet-hotels-and-boarding-houses-to-consider</w:t>
+      </w:r>
+    </w:p>
+    <w:p>
+      <w:pPr>
+        <w:spacing w:after="120" w:before="0"/>
+        <w:ind w:left="720" w:hanging="720"/>
+      </w:pPr>
+      <w:r>
+        <w:rPr>
+          <w:rFonts w:ascii="Arial" w:hAnsi="Arial" w:cs="Arial" w:eastAsia="Arial"/>
+          <w:b w:val="0"/>
+          <w:i w:val="0"/>
+          <w:sz w:val="24"/>
+        </w:rPr>
+        <w:t>Porkbun. (2026). Domain pricing. Porkbun. https://porkbun.com/products/domains</w:t>
+      </w:r>
+    </w:p>
+    <w:p>
+      <w:pPr>
+        <w:spacing w:after="120" w:before="0"/>
+        <w:ind w:left="720" w:hanging="720"/>
+      </w:pPr>
+      <w:r>
+        <w:rPr>
+          <w:rFonts w:ascii="Arial" w:hAnsi="Arial" w:cs="Arial" w:eastAsia="Arial"/>
+          <w:b w:val="0"/>
+          <w:i w:val="0"/>
+          <w:sz w:val="24"/>
+        </w:rPr>
+        <w:t>Republic Act No. 11976 (Ease of Paying Taxes Act). (2024). LawPhil. https://www.lawphil.net/statutes/repacts/ra2024/ra_11976_2024.html</w:t>
+      </w:r>
+    </w:p>
+    <w:p>
+      <w:pPr>
+        <w:spacing w:after="120" w:before="0"/>
+        <w:ind w:left="720" w:hanging="720"/>
+      </w:pPr>
+      <w:r>
+        <w:rPr>
+          <w:rFonts w:ascii="Arial" w:hAnsi="Arial" w:cs="Arial" w:eastAsia="Arial"/>
+          <w:b w:val="0"/>
+          <w:i w:val="0"/>
+          <w:sz w:val="24"/>
+        </w:rPr>
+        <w:t>Semaphore. (2026). SMS pricing and frequently asked questions. Semaphore. https://semaphore.co/</w:t>
+      </w:r>
+    </w:p>
+    <w:p>
+      <w:pPr>
+        <w:spacing w:after="120" w:before="0"/>
+        <w:ind w:left="720" w:hanging="720"/>
+      </w:pPr>
+      <w:r>
+        <w:rPr>
+          <w:rFonts w:ascii="Arial" w:hAnsi="Arial" w:cs="Arial" w:eastAsia="Arial"/>
+          <w:b w:val="0"/>
+          <w:i w:val="0"/>
+          <w:sz w:val="24"/>
+        </w:rPr>
+        <w:t>Spiralytics. (2026). Facebook ads cost in the Philippines. Spiralytics. https://www.spiralytics.com/blog/facebook-ads-costs-philippines/</w:t>
+      </w:r>
+    </w:p>
+    <w:p>
+      <w:pPr>
+        <w:spacing w:after="120" w:before="0"/>
+        <w:ind w:left="720" w:hanging="720"/>
+      </w:pPr>
+      <w:r>
+        <w:rPr>
+          <w:rFonts w:ascii="Arial" w:hAnsi="Arial" w:cs="Arial" w:eastAsia="Arial"/>
+          <w:b w:val="0"/>
+          <w:i w:val="0"/>
+          <w:sz w:val="24"/>
+        </w:rPr>
+        <w:t>Survey conducted by authors. (2025, August 19–21). Pet sitting needs and challenges among Filipino pet owners. https://forms.gle/8xjpGSSuAevckezw6. Technological Institute of the Philippines.</w:t>
+      </w:r>
+    </w:p>
+    <w:p>
+      <w:pPr>
+        <w:spacing w:after="120" w:before="0"/>
+        <w:ind w:left="720" w:hanging="720"/>
+      </w:pPr>
+      <w:r>
+        <w:rPr>
+          <w:rFonts w:ascii="Arial" w:hAnsi="Arial" w:cs="Arial" w:eastAsia="Arial"/>
+          <w:b w:val="0"/>
+          <w:i w:val="0"/>
+          <w:sz w:val="24"/>
+        </w:rPr>
         <w:t>U.S. Department of Commerce, International Trade Administration. (2021, August 13). Philippines upscale pet food and supplies. trade.gov. https://www.trade.gov/market-intelligence/philippines-upscale-pet-food-and-supplies</w:t>
       </w:r>
     </w:p>
@@ -8058,7 +8312,7 @@
           <w:i w:val="0"/>
           <w:sz w:val="24"/>
         </w:rPr>
-        <w:t>Survey conducted by authors. (2025, August 19–21). Pet sitting needs and challenges among Filipino pet owners. https://forms.gle/8xjpGSSuAevckezw6. Technological Institute of the Philippines.</w:t>
+        <w:t>UniSMS. (2026). SMS pricing. UniSMS. https://unismsapi.com/pricing</w:t>
       </w:r>
     </w:p>
     <w:sectPr>

</xml_diff>